<commit_message>
feat(pwm): add the apb_adv_timer wrapper, generated with emacs verilog-mode
- rtl/emacs/m_qnsc_wrap_apb_adv_timer.src.sv, expanded by make wrap into
  rtl/m_qnsc_wrap_apb_adv_timer.sv. No bridge: the IP speaks APB.
- The wrapper synchronises i_pad_tim_ext[3:0] into ext_sig_i[3:0]
  ([31:4] = 0), drives o_pad_pwm[7:0] from modules 0 and 1, leaves modules
  2 and 3 open and ties dft_cg_enable_i and low_speed_clk_i to 0 (MAS 5,
  7.3, 10). APB address width is C_APB_PADDR_WIDTH.
- rtl/pulp_clock_gating.sv: the clock gate the IP instantiates, mapped onto
  OpenTitan prim_clock_gating.
- design/common/rtl/qnsc_sync.sv: the shared flip-flop synchroniser, so
  every crossing is one named cell (PWM now, SYSDBG next).
- waivers.vlt: the two intentionally open channel outputs.
- MAS V2.3: an unconfigured channel goes to 1 at CMD.START (reset MODE 0 is
  SET, reset TH 0 matches at once), found by simulating the wrapper.
</commit_message>
<xml_diff>
--- a/doc/specs/docx/QNSC_PWM_MAS.docx
+++ b/doc/specs/docx/QNSC_PWM_MAS.docx
@@ -15,7 +15,7 @@
         <w:pStyle w:val="Subtitle"/>
       </w:pPr>
       <w:r>
-        <w:t xml:space="preserve">MICRO-ARCHITECTURE SPECIFICATION – V2.2</w:t>
+        <w:t xml:space="preserve">MICRO-ARCHITECTURE SPECIFICATION – V2.3</w:t>
       </w:r>
     </w:p>
     <w:p>
@@ -579,6 +579,173 @@
           </w:p>
         </w:tc>
       </w:tr>
+      <w:tr>
+        <w:tc>
+          <w:tcPr/>
+          <w:p>
+            <w:pPr>
+              <w:pStyle w:val="Compact"/>
+              <w:jc w:val="left"/>
+            </w:pPr>
+            <w:r>
+              <w:t xml:space="preserve">V2.3</w:t>
+            </w:r>
+          </w:p>
+        </w:tc>
+        <w:tc>
+          <w:tcPr/>
+          <w:p>
+            <w:pPr>
+              <w:pStyle w:val="Compact"/>
+              <w:jc w:val="left"/>
+            </w:pPr>
+            <w:r>
+              <w:t xml:space="preserve">2026-09-25</w:t>
+            </w:r>
+          </w:p>
+        </w:tc>
+        <w:tc>
+          <w:tcPr/>
+          <w:p>
+            <w:pPr>
+              <w:pStyle w:val="Compact"/>
+              <w:jc w:val="left"/>
+            </w:pPr>
+            <w:r>
+              <w:t xml:space="preserve">Nghia VT</w:t>
+            </w:r>
+          </w:p>
+        </w:tc>
+        <w:tc>
+          <w:tcPr/>
+          <w:p>
+            <w:pPr>
+              <w:pStyle w:val="Compact"/>
+              <w:jc w:val="left"/>
+            </w:pPr>
+            <w:r>
+              <w:t xml:space="preserve">–</w:t>
+            </w:r>
+          </w:p>
+        </w:tc>
+        <w:tc>
+          <w:tcPr/>
+          <w:p>
+            <w:pPr>
+              <w:pStyle w:val="Compact"/>
+              <w:jc w:val="left"/>
+            </w:pPr>
+            <w:r>
+              <w:t xml:space="preserve">7.2: an unconfigured channel goes to 1 at</w:t>
+            </w:r>
+            <w:r>
+              <w:t xml:space="preserve"> </w:t>
+            </w:r>
+            <w:r>
+              <w:rPr>
+                <w:rStyle w:val="VerbatimChar"/>
+              </w:rPr>
+              <w:t xml:space="preserve">CMD.START</w:t>
+            </w:r>
+            <w:r>
+              <w:t xml:space="preserve"> </w:t>
+            </w:r>
+            <w:r>
+              <w:t xml:space="preserve">(reset</w:t>
+            </w:r>
+            <w:r>
+              <w:t xml:space="preserve"> </w:t>
+            </w:r>
+            <w:r>
+              <w:rPr>
+                <w:rStyle w:val="VerbatimChar"/>
+              </w:rPr>
+              <w:t xml:space="preserve">MODE</w:t>
+            </w:r>
+            <w:r>
+              <w:t xml:space="preserve"> </w:t>
+            </w:r>
+            <w:r>
+              <w:t xml:space="preserve">0 is SET, reset</w:t>
+            </w:r>
+            <w:r>
+              <w:t xml:space="preserve"> </w:t>
+            </w:r>
+            <w:r>
+              <w:rPr>
+                <w:rStyle w:val="VerbatimChar"/>
+              </w:rPr>
+              <w:t xml:space="preserve">TH</w:t>
+            </w:r>
+            <w:r>
+              <w:t xml:space="preserve"> </w:t>
+            </w:r>
+            <w:r>
+              <w:t xml:space="preserve">0 matches at once), seen in simulation of the wrapper.</w:t>
+            </w:r>
+            <w:r>
+              <w:t xml:space="preserve"> </w:t>
+            </w:r>
+            <w:r>
+              <w:rPr>
+                <w:rStyle w:val="VerbatimChar"/>
+              </w:rPr>
+              <w:t xml:space="preserve">TIM_EXT</w:t>
+            </w:r>
+            <w:r>
+              <w:t xml:space="preserve"> </w:t>
+            </w:r>
+            <w:r>
+              <w:t xml:space="preserve">synchronised by the shared</w:t>
+            </w:r>
+            <w:r>
+              <w:t xml:space="preserve"> </w:t>
+            </w:r>
+            <w:r>
+              <w:rPr>
+                <w:rStyle w:val="VerbatimChar"/>
+              </w:rPr>
+              <w:t xml:space="preserve">qnsc_sync</w:t>
+            </w:r>
+            <w:r>
+              <w:t xml:space="preserve"> </w:t>
+            </w:r>
+            <w:r>
+              <w:t xml:space="preserve">cell. Moved to</w:t>
+            </w:r>
+            <w:r>
+              <w:t xml:space="preserve"> </w:t>
+            </w:r>
+            <w:r>
+              <w:rPr>
+                <w:rStyle w:val="VerbatimChar"/>
+              </w:rPr>
+              <w:t xml:space="preserve">APB_M12</w:t>
+            </w:r>
+            <w:r>
+              <w:t xml:space="preserve"> </w:t>
+            </w:r>
+            <w:r>
+              <w:t xml:space="preserve">at</w:t>
+            </w:r>
+            <w:r>
+              <w:t xml:space="preserve"> </w:t>
+            </w:r>
+            <w:r>
+              <w:rPr>
+                <w:rStyle w:val="VerbatimChar"/>
+              </w:rPr>
+              <w:t xml:space="preserve">0x8003_0000</w:t>
+            </w:r>
+            <w:r>
+              <w:t xml:space="preserve"> </w:t>
+            </w:r>
+            <w:r>
+              <w:t xml:space="preserve">with the peripherals after the dropped GPIO3</w:t>
+            </w:r>
+          </w:p>
+        </w:tc>
+      </w:tr>
     </w:tbl>
     <w:bookmarkEnd w:id="26"/>
     <w:bookmarkStart w:id="27" w:name="overview"/>
@@ -2083,7 +2250,28 @@
               <w:t xml:space="preserve"> </w:t>
             </w:r>
             <w:r>
-              <w:t xml:space="preserve">through IO MUX. Two flip-flops in the wrapper synchronise it to</w:t>
+              <w:t xml:space="preserve">through IO MUX. Two flip-flops in the wrapper (</w:t>
+            </w:r>
+            <w:r>
+              <w:rPr>
+                <w:rStyle w:val="VerbatimChar"/>
+              </w:rPr>
+              <w:t xml:space="preserve">qnsc_sync</w:t>
+            </w:r>
+            <w:r>
+              <w:t xml:space="preserve">,</w:t>
+            </w:r>
+            <w:r>
+              <w:t xml:space="preserve"> </w:t>
+            </w:r>
+            <w:r>
+              <w:rPr>
+                <w:rStyle w:val="VerbatimChar"/>
+              </w:rPr>
+              <w:t xml:space="preserve">design/common</w:t>
+            </w:r>
+            <w:r>
+              <w:t xml:space="preserve">) synchronise it to</w:t>
             </w:r>
             <w:r>
               <w:t xml:space="preserve"> </w:t>
@@ -5040,6 +5228,108 @@
       </w:r>
       <w:r>
         <w:t xml:space="preserve">drives the output to 0 in every MODE.</w:t>
+      </w:r>
+    </w:p>
+    <w:p>
+      <w:pPr>
+        <w:pStyle w:val="BodyText"/>
+      </w:pPr>
+      <w:r>
+        <w:rPr>
+          <w:b/>
+          <w:bCs/>
+        </w:rPr>
+        <w:t xml:space="preserve">Unconfigured channels.</w:t>
+      </w:r>
+      <w:r>
+        <w:t xml:space="preserve"> </w:t>
+      </w:r>
+      <w:r>
+        <w:t xml:space="preserve">Out of reset every channel has</w:t>
+      </w:r>
+      <w:r>
+        <w:t xml:space="preserve"> </w:t>
+      </w:r>
+      <w:r>
+        <w:rPr>
+          <w:rStyle w:val="VerbatimChar"/>
+        </w:rPr>
+        <w:t xml:space="preserve">MODE</w:t>
+      </w:r>
+      <w:r>
+        <w:t xml:space="preserve"> </w:t>
+      </w:r>
+      <w:r>
+        <w:t xml:space="preserve">0 (SET) and</w:t>
+      </w:r>
+      <w:r>
+        <w:t xml:space="preserve"> </w:t>
+      </w:r>
+      <w:r>
+        <w:rPr>
+          <w:rStyle w:val="VerbatimChar"/>
+        </w:rPr>
+        <w:t xml:space="preserve">TH</w:t>
+      </w:r>
+      <w:r>
+        <w:t xml:space="preserve"> </w:t>
+      </w:r>
+      <w:r>
+        <w:t xml:space="preserve">0,</w:t>
+      </w:r>
+      <w:r>
+        <w:t xml:space="preserve"> </w:t>
+      </w:r>
+      <w:r>
+        <w:t xml:space="preserve">so</w:t>
+      </w:r>
+      <w:r>
+        <w:t xml:space="preserve"> </w:t>
+      </w:r>
+      <w:r>
+        <w:rPr>
+          <w:rStyle w:val="VerbatimChar"/>
+        </w:rPr>
+        <w:t xml:space="preserve">CMD.START</w:t>
+      </w:r>
+      <w:r>
+        <w:t xml:space="preserve"> </w:t>
+      </w:r>
+      <w:r>
+        <w:t xml:space="preserve">drives each channel firmware did not configure to 1 at the first</w:t>
+      </w:r>
+      <w:r>
+        <w:t xml:space="preserve"> </w:t>
+      </w:r>
+      <w:r>
+        <w:t xml:space="preserve">count of 0, and it stays 1. Before</w:t>
+      </w:r>
+      <w:r>
+        <w:t xml:space="preserve"> </w:t>
+      </w:r>
+      <w:r>
+        <w:rPr>
+          <w:rStyle w:val="VerbatimChar"/>
+        </w:rPr>
+        <w:t xml:space="preserve">CMD.START</w:t>
+      </w:r>
+      <w:r>
+        <w:t xml:space="preserve">, set every channel of the module:</w:t>
+      </w:r>
+      <w:r>
+        <w:t xml:space="preserve"> </w:t>
+      </w:r>
+      <w:r>
+        <w:rPr>
+          <w:rStyle w:val="VerbatimChar"/>
+        </w:rPr>
+        <w:t xml:space="preserve">MODE</w:t>
+      </w:r>
+      <w:r>
+        <w:t xml:space="preserve"> </w:t>
+      </w:r>
+      <w:r>
+        <w:t xml:space="preserve">4 (RST) keeps an unused output at 0.</w:t>
       </w:r>
     </w:p>
     <w:bookmarkEnd w:id="37"/>
@@ -9003,7 +9293,7 @@
       <w:rPr>
         <w:szCs w:val="26"/>
       </w:rPr>
-      <w:t>V2.2</w:t>
+      <w:t>V2.3</w:t>
     </w:r>
     <w:r>
       <w:rPr>

</xml_diff>

<commit_message>
docs(pwm): section 12 checks carry PWM_NNN ids
</commit_message>
<xml_diff>
--- a/doc/specs/docx/QNSC_PWM_MAS.docx
+++ b/doc/specs/docx/QNSC_PWM_MAS.docx
@@ -15,7 +15,7 @@
         <w:pStyle w:val="Subtitle"/>
       </w:pPr>
       <w:r>
-        <w:t xml:space="preserve">MICRO-ARCHITECTURE SPECIFICATION – V2.5</w:t>
+        <w:t xml:space="preserve">MICRO-ARCHITECTURE SPECIFICATION – V2.6</w:t>
       </w:r>
     </w:p>
     <w:p>
@@ -996,6 +996,77 @@
           </w:p>
         </w:tc>
       </w:tr>
+      <w:tr>
+        <w:tc>
+          <w:tcPr/>
+          <w:p>
+            <w:pPr>
+              <w:pStyle w:val="Compact"/>
+              <w:jc w:val="left"/>
+            </w:pPr>
+            <w:r>
+              <w:t xml:space="preserve">V2.6</w:t>
+            </w:r>
+          </w:p>
+        </w:tc>
+        <w:tc>
+          <w:tcPr/>
+          <w:p>
+            <w:pPr>
+              <w:pStyle w:val="Compact"/>
+              <w:jc w:val="left"/>
+            </w:pPr>
+            <w:r>
+              <w:t xml:space="preserve">2026-09-30</w:t>
+            </w:r>
+          </w:p>
+        </w:tc>
+        <w:tc>
+          <w:tcPr/>
+          <w:p>
+            <w:pPr>
+              <w:pStyle w:val="Compact"/>
+              <w:jc w:val="left"/>
+            </w:pPr>
+            <w:r>
+              <w:t xml:space="preserve">Nghia VT</w:t>
+            </w:r>
+          </w:p>
+        </w:tc>
+        <w:tc>
+          <w:tcPr/>
+          <w:p>
+            <w:pPr>
+              <w:pStyle w:val="Compact"/>
+              <w:jc w:val="left"/>
+            </w:pPr>
+            <w:r>
+              <w:t xml:space="preserve">–</w:t>
+            </w:r>
+          </w:p>
+        </w:tc>
+        <w:tc>
+          <w:tcPr/>
+          <w:p>
+            <w:pPr>
+              <w:pStyle w:val="Compact"/>
+              <w:jc w:val="left"/>
+            </w:pPr>
+            <w:r>
+              <w:t xml:space="preserve">Section 12: every check carries an ID (</w:t>
+            </w:r>
+            <w:r>
+              <w:rPr>
+                <w:rStyle w:val="VerbatimChar"/>
+              </w:rPr>
+              <w:t xml:space="preserve">PWM_NNN</w:t>
+            </w:r>
+            <w:r>
+              <w:t xml:space="preserve">), for traceability to tests. No change in behaviour</w:t>
+            </w:r>
+          </w:p>
+        </w:tc>
+      </w:tr>
     </w:tbl>
     <w:bookmarkEnd w:id="26"/>
     <w:bookmarkStart w:id="27" w:name="overview"/>
@@ -8407,6 +8478,15 @@
         <w:rPr>
           <w:rStyle w:val="VerbatimChar"/>
         </w:rPr>
+        <w:t xml:space="preserve">PWM_001</w:t>
+      </w:r>
+      <w:r>
+        <w:t xml:space="preserve"> </w:t>
+      </w:r>
+      <w:r>
+        <w:rPr>
+          <w:rStyle w:val="VerbatimChar"/>
+        </w:rPr>
         <w:t xml:space="preserve">ch_i_o[n]</w:t>
       </w:r>
       <w:r>
@@ -8507,6 +8587,15 @@
         <w:jc w:val="left"/>
       </w:pPr>
       <w:r>
+        <w:rPr>
+          <w:rStyle w:val="VerbatimChar"/>
+        </w:rPr>
+        <w:t xml:space="preserve">PWM_002</w:t>
+      </w:r>
+      <w:r>
+        <w:t xml:space="preserve"> </w:t>
+      </w:r>
+      <w:r>
         <w:t xml:space="preserve">Every register field resets to the value in section 6; reserved bits and</w:t>
       </w:r>
       <w:r>
@@ -8535,6 +8624,15 @@
         <w:jc w:val="left"/>
       </w:pPr>
       <w:r>
+        <w:rPr>
+          <w:rStyle w:val="VerbatimChar"/>
+        </w:rPr>
+        <w:t xml:space="preserve">PWM_003</w:t>
+      </w:r>
+      <w:r>
+        <w:t xml:space="preserve"> </w:t>
+      </w:r>
+      <w:r>
         <w:t xml:space="preserve">Out of reset,</w:t>
       </w:r>
       <w:r>
@@ -8581,6 +8679,15 @@
         <w:rPr>
           <w:rStyle w:val="VerbatimChar"/>
         </w:rPr>
+        <w:t xml:space="preserve">PWM_004</w:t>
+      </w:r>
+      <w:r>
+        <w:t xml:space="preserve"> </w:t>
+      </w:r>
+      <w:r>
+        <w:rPr>
+          <w:rStyle w:val="VerbatimChar"/>
+        </w:rPr>
         <w:t xml:space="preserve">SAW</w:t>
       </w:r>
       <w:r>
@@ -8621,6 +8728,15 @@
         <w:jc w:val="left"/>
       </w:pPr>
       <w:r>
+        <w:rPr>
+          <w:rStyle w:val="VerbatimChar"/>
+        </w:rPr>
+        <w:t xml:space="preserve">PWM_005</w:t>
+      </w:r>
+      <w:r>
+        <w:t xml:space="preserve"> </w:t>
+      </w:r>
+      <w:r>
         <w:t xml:space="preserve">Each</w:t>
       </w:r>
       <w:r>
@@ -8679,6 +8795,15 @@
         <w:jc w:val="left"/>
       </w:pPr>
       <w:r>
+        <w:rPr>
+          <w:rStyle w:val="VerbatimChar"/>
+        </w:rPr>
+        <w:t xml:space="preserve">PWM_006</w:t>
+      </w:r>
+      <w:r>
+        <w:t xml:space="preserve"> </w:t>
+      </w:r>
+      <w:r>
         <w:t xml:space="preserve">Changing one</w:t>
       </w:r>
       <w:r>
@@ -8743,6 +8868,15 @@
         <w:rPr>
           <w:rStyle w:val="VerbatimChar"/>
         </w:rPr>
+        <w:t xml:space="preserve">PWM_007</w:t>
+      </w:r>
+      <w:r>
+        <w:t xml:space="preserve"> </w:t>
+      </w:r>
+      <w:r>
+        <w:rPr>
+          <w:rStyle w:val="VerbatimChar"/>
+        </w:rPr>
         <w:t xml:space="preserve">CMD.STOP</w:t>
       </w:r>
       <w:r>
@@ -8777,6 +8911,15 @@
         <w:jc w:val="left"/>
       </w:pPr>
       <w:r>
+        <w:rPr>
+          <w:rStyle w:val="VerbatimChar"/>
+        </w:rPr>
+        <w:t xml:space="preserve">PWM_008</w:t>
+      </w:r>
+      <w:r>
+        <w:t xml:space="preserve"> </w:t>
+      </w:r>
+      <w:r>
         <w:t xml:space="preserve">An event fires on a rising edge of the selected channel only, is one</w:t>
       </w:r>
       <w:r>
@@ -8820,6 +8963,15 @@
         <w:jc w:val="left"/>
       </w:pPr>
       <w:r>
+        <w:rPr>
+          <w:rStyle w:val="VerbatimChar"/>
+        </w:rPr>
+        <w:t xml:space="preserve">PWM_009</w:t>
+      </w:r>
+      <w:r>
+        <w:t xml:space="preserve"> </w:t>
+      </w:r>
+      <w:r>
         <w:t xml:space="preserve">Each</w:t>
       </w:r>
       <w:r>
@@ -8893,6 +9045,15 @@
         <w:jc w:val="left"/>
       </w:pPr>
       <w:r>
+        <w:rPr>
+          <w:rStyle w:val="VerbatimChar"/>
+        </w:rPr>
+        <w:t xml:space="preserve">PWM_010</w:t>
+      </w:r>
+      <w:r>
+        <w:t xml:space="preserve"> </w:t>
+      </w:r>
+      <w:r>
         <w:t xml:space="preserve">Holes read 0 and ignore writes; offset</w:t>
       </w:r>
       <w:r>
@@ -8935,6 +9096,15 @@
         </w:numPr>
         <w:jc w:val="left"/>
       </w:pPr>
+      <w:r>
+        <w:rPr>
+          <w:rStyle w:val="VerbatimChar"/>
+        </w:rPr>
+        <w:t xml:space="preserve">PWM_011</w:t>
+      </w:r>
+      <w:r>
+        <w:t xml:space="preserve"> </w:t>
+      </w:r>
       <w:r>
         <w:t xml:space="preserve">Confirm in simulation: when a new</w:t>
       </w:r>
@@ -9761,7 +9931,7 @@
       <w:rPr>
         <w:szCs w:val="26"/>
       </w:rPr>
-      <w:t>V2.5</w:t>
+      <w:t>V2.6</w:t>
     </w:r>
     <w:r>
       <w:rPr>

</xml_diff>

<commit_message>
fix(pwm): mas v2.7, qnsc_clk_gate, word writes only, accepted limits
- pulp_clock_gating instantiates qnsc_clk_gate, the chip's one clock gate
  (Naming Rule 2.8); prim_clock_gating leaves pwm.f, the flows add the
  technology cells
- MAS 7.6: the IP has no PSTRB or PPROT, so firmware writes words only
- MAS 11: no dead time, complementary output or break input
- DECISIONS: the pin tables are superseded by the 40-pin pad list
- wrapper header and README name MAS V2.7 and qnsc_clk_gate
</commit_message>
<xml_diff>
--- a/doc/specs/docx/QNSC_PWM_MAS.docx
+++ b/doc/specs/docx/QNSC_PWM_MAS.docx
@@ -15,7 +15,7 @@
         <w:pStyle w:val="Subtitle"/>
       </w:pPr>
       <w:r>
-        <w:t xml:space="preserve">MICRO-ARCHITECTURE SPECIFICATION – V2.6</w:t>
+        <w:t xml:space="preserve">MICRO-ARCHITECTURE SPECIFICATION – V2.7</w:t>
       </w:r>
     </w:p>
     <w:p>
@@ -1067,6 +1067,119 @@
           </w:p>
         </w:tc>
       </w:tr>
+      <w:tr>
+        <w:tc>
+          <w:tcPr/>
+          <w:p>
+            <w:pPr>
+              <w:pStyle w:val="Compact"/>
+              <w:jc w:val="left"/>
+            </w:pPr>
+            <w:r>
+              <w:t xml:space="preserve">V2.7</w:t>
+            </w:r>
+          </w:p>
+        </w:tc>
+        <w:tc>
+          <w:tcPr/>
+          <w:p>
+            <w:pPr>
+              <w:pStyle w:val="Compact"/>
+              <w:jc w:val="left"/>
+            </w:pPr>
+            <w:r>
+              <w:t xml:space="preserve">2026-10-09</w:t>
+            </w:r>
+          </w:p>
+        </w:tc>
+        <w:tc>
+          <w:tcPr/>
+          <w:p>
+            <w:pPr>
+              <w:pStyle w:val="Compact"/>
+              <w:jc w:val="left"/>
+            </w:pPr>
+            <w:r>
+              <w:t xml:space="preserve">Nghia VT</w:t>
+            </w:r>
+          </w:p>
+        </w:tc>
+        <w:tc>
+          <w:tcPr/>
+          <w:p>
+            <w:pPr>
+              <w:pStyle w:val="Compact"/>
+              <w:jc w:val="left"/>
+            </w:pPr>
+            <w:r>
+              <w:t xml:space="preserve">–</w:t>
+            </w:r>
+          </w:p>
+        </w:tc>
+        <w:tc>
+          <w:tcPr/>
+          <w:p>
+            <w:pPr>
+              <w:pStyle w:val="Compact"/>
+              <w:jc w:val="left"/>
+            </w:pPr>
+            <w:r>
+              <w:rPr>
+                <w:rStyle w:val="VerbatimChar"/>
+              </w:rPr>
+              <w:t xml:space="preserve">pulp_clock_gating</w:t>
+            </w:r>
+            <w:r>
+              <w:t xml:space="preserve"> </w:t>
+            </w:r>
+            <w:r>
+              <w:t xml:space="preserve">maps onto</w:t>
+            </w:r>
+            <w:r>
+              <w:t xml:space="preserve"> </w:t>
+            </w:r>
+            <w:r>
+              <w:rPr>
+                <w:rStyle w:val="VerbatimChar"/>
+              </w:rPr>
+              <w:t xml:space="preserve">qnsc_clk_gate</w:t>
+            </w:r>
+            <w:r>
+              <w:t xml:space="preserve">, the chip’s one clock gate (4). Word writes only: the IP has no</w:t>
+            </w:r>
+            <w:r>
+              <w:t xml:space="preserve"> </w:t>
+            </w:r>
+            <w:r>
+              <w:rPr>
+                <w:rStyle w:val="VerbatimChar"/>
+              </w:rPr>
+              <w:t xml:space="preserve">PSTRB</w:t>
+            </w:r>
+            <w:r>
+              <w:t xml:space="preserve"> </w:t>
+            </w:r>
+            <w:r>
+              <w:t xml:space="preserve">or</w:t>
+            </w:r>
+            <w:r>
+              <w:t xml:space="preserve"> </w:t>
+            </w:r>
+            <w:r>
+              <w:rPr>
+                <w:rStyle w:val="VerbatimChar"/>
+              </w:rPr>
+              <w:t xml:space="preserve">PPROT</w:t>
+            </w:r>
+            <w:r>
+              <w:t xml:space="preserve"> </w:t>
+            </w:r>
+            <w:r>
+              <w:t xml:space="preserve">(7.6). No dead time, complementary output or break input (11). No change in behaviour</w:t>
+            </w:r>
+          </w:p>
+        </w:tc>
+      </w:tr>
     </w:tbl>
     <w:bookmarkEnd w:id="26"/>
     <w:bookmarkStart w:id="27" w:name="overview"/>
@@ -1922,22 +2035,55 @@
         <w:t xml:space="preserve">design/pwm/rtl</w:t>
       </w:r>
       <w:r>
-        <w:t xml:space="preserve"> </w:t>
-      </w:r>
-      <w:r>
-        <w:t xml:space="preserve">as a wrapper of OpenTitan</w:t>
-      </w:r>
-      <w:r>
-        <w:t xml:space="preserve"> </w:t>
-      </w:r>
-      <w:r>
-        <w:rPr>
-          <w:rStyle w:val="VerbatimChar"/>
-        </w:rPr>
-        <w:t xml:space="preserve">prim_clock_gating</w:t>
-      </w:r>
-      <w:r>
-        <w:t xml:space="preserve">, which has the same ports and is the cell Ibex already uses.</w:t>
+        <w:t xml:space="preserve">. It instantiates</w:t>
+      </w:r>
+      <w:r>
+        <w:t xml:space="preserve"> </w:t>
+      </w:r>
+      <w:r>
+        <w:rPr>
+          <w:rStyle w:val="VerbatimChar"/>
+        </w:rPr>
+        <w:t xml:space="preserve">qnsc_clk_gate</w:t>
+      </w:r>
+      <w:r>
+        <w:t xml:space="preserve">,</w:t>
+      </w:r>
+      <w:r>
+        <w:t xml:space="preserve"> </w:t>
+      </w:r>
+      <w:r>
+        <w:t xml:space="preserve">the one clock gate of QSOC (</w:t>
+      </w:r>
+      <w:r>
+        <w:rPr>
+          <w:rStyle w:val="VerbatimChar"/>
+        </w:rPr>
+        <w:t xml:space="preserve">design/common/tech/</w:t>
+      </w:r>
+      <w:r>
+        <w:t xml:space="preserve">, Naming Rule 2.8), so the</w:t>
+      </w:r>
+      <w:r>
+        <w:t xml:space="preserve"> </w:t>
+      </w:r>
+      <w:r>
+        <w:t xml:space="preserve">technology selected with</w:t>
+      </w:r>
+      <w:r>
+        <w:t xml:space="preserve"> </w:t>
+      </w:r>
+      <w:r>
+        <w:rPr>
+          <w:rStyle w:val="VerbatimChar"/>
+        </w:rPr>
+        <w:t xml:space="preserve">TECH</w:t>
+      </w:r>
+      <w:r>
+        <w:t xml:space="preserve"> </w:t>
+      </w:r>
+      <w:r>
+        <w:t xml:space="preserve">supplies the cell here as in every other block.</w:t>
       </w:r>
     </w:p>
     <w:bookmarkEnd w:id="33"/>
@@ -7258,6 +7404,80 @@
         <w:t xml:space="preserve">is 1.</w:t>
       </w:r>
     </w:p>
+    <w:p>
+      <w:pPr>
+        <w:pStyle w:val="BodyText"/>
+      </w:pPr>
+      <w:r>
+        <w:t xml:space="preserve">The IP has no</w:t>
+      </w:r>
+      <w:r>
+        <w:t xml:space="preserve"> </w:t>
+      </w:r>
+      <w:r>
+        <w:rPr>
+          <w:rStyle w:val="VerbatimChar"/>
+        </w:rPr>
+        <w:t xml:space="preserve">PSTRB</w:t>
+      </w:r>
+      <w:r>
+        <w:t xml:space="preserve"> </w:t>
+      </w:r>
+      <w:r>
+        <w:t xml:space="preserve">and no</w:t>
+      </w:r>
+      <w:r>
+        <w:t xml:space="preserve"> </w:t>
+      </w:r>
+      <w:r>
+        <w:rPr>
+          <w:rStyle w:val="VerbatimChar"/>
+        </w:rPr>
+        <w:t xml:space="preserve">PPROT</w:t>
+      </w:r>
+      <w:r>
+        <w:t xml:space="preserve">, and the wrapper takes neither from</w:t>
+      </w:r>
+      <w:r>
+        <w:t xml:space="preserve"> </w:t>
+      </w:r>
+      <w:r>
+        <w:rPr>
+          <w:rStyle w:val="VerbatimChar"/>
+        </w:rPr>
+        <w:t xml:space="preserve">P_BUS</w:t>
+      </w:r>
+      <w:r>
+        <w:t xml:space="preserve">.</w:t>
+      </w:r>
+      <w:r>
+        <w:t xml:space="preserve"> </w:t>
+      </w:r>
+      <w:r>
+        <w:t xml:space="preserve">Every write writes all 32 bits of the register: firmware accesses this block with</w:t>
+      </w:r>
+      <w:r>
+        <w:t xml:space="preserve"> </w:t>
+      </w:r>
+      <w:r>
+        <w:t xml:space="preserve">word stores (</w:t>
+      </w:r>
+      <w:r>
+        <w:rPr>
+          <w:rStyle w:val="VerbatimChar"/>
+        </w:rPr>
+        <w:t xml:space="preserve">sw</w:t>
+      </w:r>
+      <w:r>
+        <w:t xml:space="preserve">) only. A byte or halfword store writes the other bytes with</w:t>
+      </w:r>
+      <w:r>
+        <w:t xml:space="preserve"> </w:t>
+      </w:r>
+      <w:r>
+        <w:t xml:space="preserve">whatever the bus carries in those lanes.</w:t>
+      </w:r>
+    </w:p>
     <w:bookmarkEnd w:id="41"/>
     <w:bookmarkStart w:id="42" w:name="clock-gating-and-safe-stop"/>
     <w:p>
@@ -8427,6 +8647,44 @@
       </w:r>
       <w:r>
         <w:t xml:space="preserve">has no effect – section 6.</w:t>
+      </w:r>
+    </w:p>
+    <w:p>
+      <w:pPr>
+        <w:pStyle w:val="Compact"/>
+        <w:numPr>
+          <w:ilvl w:val="0"/>
+          <w:numId w:val="1005"/>
+        </w:numPr>
+        <w:jc w:val="left"/>
+      </w:pPr>
+      <w:r>
+        <w:t xml:space="preserve">No dead-time insertion, no complementary output pair and no break (fault) input:</w:t>
+      </w:r>
+      <w:r>
+        <w:t xml:space="preserve"> </w:t>
+      </w:r>
+      <w:r>
+        <w:t xml:space="preserve">a half bridge driven from two channels gets no hardware protection against</w:t>
+      </w:r>
+      <w:r>
+        <w:t xml:space="preserve"> </w:t>
+      </w:r>
+      <w:r>
+        <w:t xml:space="preserve">shoot-through.</w:t>
+      </w:r>
+    </w:p>
+    <w:p>
+      <w:pPr>
+        <w:pStyle w:val="Compact"/>
+        <w:numPr>
+          <w:ilvl w:val="0"/>
+          <w:numId w:val="1005"/>
+        </w:numPr>
+        <w:jc w:val="left"/>
+      </w:pPr>
+      <w:r>
+        <w:t xml:space="preserve">Word writes only – 7.6.</w:t>
       </w:r>
     </w:p>
     <w:p>
@@ -9931,7 +10189,7 @@
       <w:rPr>
         <w:szCs w:val="26"/>
       </w:rPr>
-      <w:t>V2.6</w:t>
+      <w:t>V2.7</w:t>
     </w:r>
     <w:r>
       <w:rPr>

</xml_diff>

<commit_message>
test(pwm): pwm_011, when a new value takes effect; mas v2.8
PWM_011 was "confirm in simulation". The RTL read suggested CHn_TH and
PRESC load at every count event and TH only at START/UPDATE; the test
measures it, each assertion proven to fail when its expected value is
changed. The result is MAS 7.8, and the consequence for firmware: lowering
CHn_TH below the counter misses the match and gives one long pulse.

MAS V2.8 also states the RSTSET measurement (TH + 1 cycles) in 7.2.
DECISIONS: three lines superseded (low_speed_clk_i tied 0, not to the clock;
pulp_clock_gating maps onto qnsc_clk_gate).
dv/README: tb_pwm does read +test (the line added in #71 said it did not).
</commit_message>
<xml_diff>
--- a/doc/specs/docx/QNSC_PWM_MAS.docx
+++ b/doc/specs/docx/QNSC_PWM_MAS.docx
@@ -15,7 +15,7 @@
         <w:pStyle w:val="Subtitle"/>
       </w:pPr>
       <w:r>
-        <w:t xml:space="preserve">MICRO-ARCHITECTURE SPECIFICATION – V2.8</w:t>
+        <w:t xml:space="preserve">MICRO-ARCHITECTURE SPECIFICATION – V2.9</w:t>
       </w:r>
     </w:p>
     <w:p>
@@ -143,6 +143,16 @@
             <w:jc w:val="left"/>
           </w:pPr>
           <w:r>
+            <w:t xml:space="preserve">Table 7-5. When a write takes effect</w:t>
+          </w:r>
+        </w:p>
+        <w:p>
+          <w:pPr>
+            <w:pStyle w:val="TOC1"/>
+            <w:ind w:left="180"/>
+            <w:jc w:val="left"/>
+          </w:pPr>
+          <w:r>
             <w:t xml:space="preserve">Table 9-1. Functions this block does not provide</w:t>
           </w:r>
         </w:p>
@@ -1308,6 +1318,155 @@
           </w:p>
         </w:tc>
       </w:tr>
+      <w:tr>
+        <w:tc>
+          <w:tcPr/>
+          <w:p>
+            <w:pPr>
+              <w:pStyle w:val="Compact"/>
+              <w:jc w:val="left"/>
+            </w:pPr>
+            <w:r>
+              <w:t xml:space="preserve">V2.9</w:t>
+            </w:r>
+          </w:p>
+        </w:tc>
+        <w:tc>
+          <w:tcPr/>
+          <w:p>
+            <w:pPr>
+              <w:pStyle w:val="Compact"/>
+              <w:jc w:val="left"/>
+            </w:pPr>
+            <w:r>
+              <w:t xml:space="preserve">2026-10-12</w:t>
+            </w:r>
+          </w:p>
+        </w:tc>
+        <w:tc>
+          <w:tcPr/>
+          <w:p>
+            <w:pPr>
+              <w:pStyle w:val="Compact"/>
+              <w:jc w:val="left"/>
+            </w:pPr>
+            <w:r>
+              <w:t xml:space="preserve">Nghia VT</w:t>
+            </w:r>
+          </w:p>
+        </w:tc>
+        <w:tc>
+          <w:tcPr/>
+          <w:p>
+            <w:pPr>
+              <w:pStyle w:val="Compact"/>
+              <w:jc w:val="left"/>
+            </w:pPr>
+            <w:r>
+              <w:t xml:space="preserve">–</w:t>
+            </w:r>
+          </w:p>
+        </w:tc>
+        <w:tc>
+          <w:tcPr/>
+          <w:p>
+            <w:pPr>
+              <w:pStyle w:val="Compact"/>
+              <w:jc w:val="left"/>
+            </w:pPr>
+            <w:r>
+              <w:t xml:space="preserve">7.2: with</w:t>
+            </w:r>
+            <w:r>
+              <w:t xml:space="preserve"> </w:t>
+            </w:r>
+            <w:r>
+              <w:rPr>
+                <w:rStyle w:val="VerbatimChar"/>
+              </w:rPr>
+              <w:t xml:space="preserve">SAW</w:t>
+            </w:r>
+            <w:r>
+              <w:t xml:space="preserve"> </w:t>
+            </w:r>
+            <w:r>
+              <w:t xml:space="preserve">= 1,</w:t>
+            </w:r>
+            <w:r>
+              <w:t xml:space="preserve"> </w:t>
+            </w:r>
+            <w:r>
+              <w:rPr>
+                <w:rStyle w:val="VerbatimChar"/>
+              </w:rPr>
+              <w:t xml:space="preserve">RSTSET</w:t>
+            </w:r>
+            <w:r>
+              <w:t xml:space="preserve"> </w:t>
+            </w:r>
+            <w:r>
+              <w:t xml:space="preserve">is high</w:t>
+            </w:r>
+            <w:r>
+              <w:t xml:space="preserve"> </w:t>
+            </w:r>
+            <w:r>
+              <w:rPr>
+                <w:rStyle w:val="VerbatimChar"/>
+              </w:rPr>
+              <w:t xml:space="preserve">TH</w:t>
+            </w:r>
+            <w:r>
+              <w:t xml:space="preserve"> </w:t>
+            </w:r>
+            <w:r>
+              <w:t xml:space="preserve">+ 1 cycles per period and</w:t>
+            </w:r>
+            <w:r>
+              <w:t xml:space="preserve"> </w:t>
+            </w:r>
+            <w:r>
+              <w:rPr>
+                <w:rStyle w:val="VerbatimChar"/>
+              </w:rPr>
+              <w:t xml:space="preserve">SETRST</w:t>
+            </w:r>
+            <w:r>
+              <w:t xml:space="preserve"> </w:t>
+            </w:r>
+            <w:r>
+              <w:t xml:space="preserve">is its complement. New 7.8: when a new value takes effect, measured by</w:t>
+            </w:r>
+            <w:r>
+              <w:t xml:space="preserve"> </w:t>
+            </w:r>
+            <w:r>
+              <w:rPr>
+                <w:rStyle w:val="VerbatimChar"/>
+              </w:rPr>
+              <w:t xml:space="preserve">PWM_011</w:t>
+            </w:r>
+            <w:r>
+              <w:t xml:space="preserve">. Section 12:</w:t>
+            </w:r>
+            <w:r>
+              <w:t xml:space="preserve"> </w:t>
+            </w:r>
+            <w:r>
+              <w:rPr>
+                <w:rStyle w:val="VerbatimChar"/>
+              </w:rPr>
+              <w:t xml:space="preserve">PWM_011</w:t>
+            </w:r>
+            <w:r>
+              <w:t xml:space="preserve"> </w:t>
+            </w:r>
+            <w:r>
+              <w:t xml:space="preserve">states what it checks</w:t>
+            </w:r>
+          </w:p>
+        </w:tc>
+      </w:tr>
     </w:tbl>
     <w:bookmarkEnd w:id="26"/>
     <w:bookmarkStart w:id="27" w:name="overview"/>
@@ -5132,7 +5291,7 @@
       </w:r>
     </w:p>
     <w:bookmarkEnd w:id="35"/>
-    <w:bookmarkStart w:id="43" w:name="functional-behaviour"/>
+    <w:bookmarkStart w:id="44" w:name="functional-behaviour"/>
     <w:p>
       <w:pPr>
         <w:pStyle w:val="Heading1"/>
@@ -5899,6 +6058,110 @@
         <w:pStyle w:val="BodyText"/>
       </w:pPr>
       <w:r>
+        <w:t xml:space="preserve">With</w:t>
+      </w:r>
+      <w:r>
+        <w:t xml:space="preserve"> </w:t>
+      </w:r>
+      <w:r>
+        <w:rPr>
+          <w:rStyle w:val="VerbatimChar"/>
+        </w:rPr>
+        <w:t xml:space="preserve">SAW</w:t>
+      </w:r>
+      <w:r>
+        <w:t xml:space="preserve"> </w:t>
+      </w:r>
+      <w:r>
+        <w:t xml:space="preserve">= 1 the counter reaches END, and the output is set at that count event, one</w:t>
+      </w:r>
+      <w:r>
+        <w:t xml:space="preserve"> </w:t>
+      </w:r>
+      <w:r>
+        <w:t xml:space="preserve">cycle before the counter is back at START. The output of MODE 6 (RSTSET) is therefore</w:t>
+      </w:r>
+      <w:r>
+        <w:t xml:space="preserve"> </w:t>
+      </w:r>
+      <w:r>
+        <w:t xml:space="preserve">high for</w:t>
+      </w:r>
+      <w:r>
+        <w:t xml:space="preserve"> </w:t>
+      </w:r>
+      <w:r>
+        <w:rPr>
+          <w:rStyle w:val="VerbatimChar"/>
+        </w:rPr>
+        <w:t xml:space="preserve">TH</w:t>
+      </w:r>
+      <w:r>
+        <w:t xml:space="preserve"> </w:t>
+      </w:r>
+      <w:r>
+        <w:t xml:space="preserve">+ 1 cycles per period:</w:t>
+      </w:r>
+      <w:r>
+        <w:t xml:space="preserve"> </w:t>
+      </w:r>
+      <w:r>
+        <w:rPr>
+          <w:rStyle w:val="VerbatimChar"/>
+        </w:rPr>
+        <w:t xml:space="preserve">TH</w:t>
+      </w:r>
+      <w:r>
+        <w:t xml:space="preserve"> </w:t>
+      </w:r>
+      <w:r>
+        <w:t xml:space="preserve">= 250, END = 999 gives 251 of 1000 cycles. It</w:t>
+      </w:r>
+      <w:r>
+        <w:t xml:space="preserve"> </w:t>
+      </w:r>
+      <w:r>
+        <w:t xml:space="preserve">rises at the start of the period and falls one cycle after the counter passes</w:t>
+      </w:r>
+      <w:r>
+        <w:t xml:space="preserve"> </w:t>
+      </w:r>
+      <w:r>
+        <w:rPr>
+          <w:rStyle w:val="VerbatimChar"/>
+        </w:rPr>
+        <w:t xml:space="preserve">TH</w:t>
+      </w:r>
+      <w:r>
+        <w:t xml:space="preserve">.</w:t>
+      </w:r>
+      <w:r>
+        <w:t xml:space="preserve"> </w:t>
+      </w:r>
+      <w:r>
+        <w:t xml:space="preserve">MODE 2 (SETRST) with the same</w:t>
+      </w:r>
+      <w:r>
+        <w:t xml:space="preserve"> </w:t>
+      </w:r>
+      <w:r>
+        <w:rPr>
+          <w:rStyle w:val="VerbatimChar"/>
+        </w:rPr>
+        <w:t xml:space="preserve">TH</w:t>
+      </w:r>
+      <w:r>
+        <w:t xml:space="preserve"> </w:t>
+      </w:r>
+      <w:r>
+        <w:t xml:space="preserve">is its exact complement.</w:t>
+      </w:r>
+    </w:p>
+    <w:p>
+      <w:pPr>
+        <w:pStyle w:val="BodyText"/>
+      </w:pPr>
+      <w:r>
         <w:rPr>
           <w:b/>
           <w:bCs/>
@@ -7863,14 +8126,13 @@
       </w:r>
     </w:p>
     <w:bookmarkEnd w:id="42"/>
-    <w:bookmarkEnd w:id="43"/>
-    <w:bookmarkStart w:id="44" w:name="instances"/>
+    <w:bookmarkStart w:id="43" w:name="when-a-new-value-takes-effect"/>
     <w:p>
       <w:pPr>
-        <w:pStyle w:val="Heading1"/>
-      </w:pPr>
-      <w:r>
-        <w:t xml:space="preserve">8. Instances</w:t>
+        <w:pStyle w:val="Heading2"/>
+      </w:pPr>
+      <w:r>
+        <w:t xml:space="preserve">7.8 When a new value takes effect</w:t>
       </w:r>
     </w:p>
     <w:p>
@@ -7878,6 +8140,523 @@
         <w:pStyle w:val="FirstParagraph"/>
       </w:pPr>
       <w:r>
+        <w:t xml:space="preserve">Measured by</w:t>
+      </w:r>
+      <w:r>
+        <w:t xml:space="preserve"> </w:t>
+      </w:r>
+      <w:r>
+        <w:rPr>
+          <w:rStyle w:val="VerbatimChar"/>
+        </w:rPr>
+        <w:t xml:space="preserve">PWM_011</w:t>
+      </w:r>
+      <w:r>
+        <w:t xml:space="preserve">, on a timer that is running unless stated.</w:t>
+      </w:r>
+    </w:p>
+    <w:p>
+      <w:pPr>
+        <w:pStyle w:val="Tablecaption0"/>
+      </w:pPr>
+      <w:r>
+        <w:t xml:space="preserve">Table 7-5. When a write takes effect</w:t>
+      </w:r>
+    </w:p>
+    <w:tbl>
+      <w:tblPr>
+        <w:tblStyle w:val="TableGrid"/>
+        <w:tblW w:type="pct" w:w="5000"/>
+        <w:tblLayout w:type="fixed"/>
+        <w:tblLook w:firstRow="1" w:lastRow="0" w:firstColumn="0" w:lastColumn="0" w:noHBand="0" w:noVBand="0" w:val="0020"/>
+        <w:tblCaption w:val="When a write takes effect"/>
+      </w:tblPr>
+      <w:tblGrid>
+        <w:gridCol w:w="3960"/>
+        <w:gridCol w:w="3960"/>
+      </w:tblGrid>
+      <w:tr>
+        <w:trPr>
+          <w:tblHeader w:val="on"/>
+        </w:trPr>
+        <w:tc>
+          <w:tcPr/>
+          <w:p>
+            <w:pPr>
+              <w:pStyle w:val="Compact"/>
+              <w:jc w:val="left"/>
+            </w:pPr>
+            <w:r>
+              <w:t xml:space="preserve">Written</w:t>
+            </w:r>
+          </w:p>
+        </w:tc>
+        <w:tc>
+          <w:tcPr/>
+          <w:p>
+            <w:pPr>
+              <w:pStyle w:val="Compact"/>
+              <w:jc w:val="left"/>
+            </w:pPr>
+            <w:r>
+              <w:t xml:space="preserve">Takes effect</w:t>
+            </w:r>
+          </w:p>
+        </w:tc>
+      </w:tr>
+      <w:tr>
+        <w:tc>
+          <w:tcPr/>
+          <w:p>
+            <w:pPr>
+              <w:pStyle w:val="Compact"/>
+              <w:jc w:val="left"/>
+            </w:pPr>
+            <w:r>
+              <w:rPr>
+                <w:rStyle w:val="VerbatimChar"/>
+              </w:rPr>
+              <w:t xml:space="preserve">TH</w:t>
+            </w:r>
+            <w:r>
+              <w:t xml:space="preserve"> </w:t>
+            </w:r>
+            <w:r>
+              <w:t xml:space="preserve">(START, END),</w:t>
+            </w:r>
+            <w:r>
+              <w:t xml:space="preserve"> </w:t>
+            </w:r>
+            <w:r>
+              <w:rPr>
+                <w:rStyle w:val="VerbatimChar"/>
+              </w:rPr>
+              <w:t xml:space="preserve">CFG.SAW</w:t>
+            </w:r>
+          </w:p>
+        </w:tc>
+        <w:tc>
+          <w:tcPr/>
+          <w:p>
+            <w:pPr>
+              <w:pStyle w:val="Compact"/>
+              <w:jc w:val="left"/>
+            </w:pPr>
+            <w:r>
+              <w:t xml:space="preserve">only at</w:t>
+            </w:r>
+            <w:r>
+              <w:t xml:space="preserve"> </w:t>
+            </w:r>
+            <w:r>
+              <w:rPr>
+                <w:rStyle w:val="VerbatimChar"/>
+              </w:rPr>
+              <w:t xml:space="preserve">CMD.START</w:t>
+            </w:r>
+            <w:r>
+              <w:t xml:space="preserve">, or at</w:t>
+            </w:r>
+            <w:r>
+              <w:t xml:space="preserve"> </w:t>
+            </w:r>
+            <w:r>
+              <w:rPr>
+                <w:rStyle w:val="VerbatimChar"/>
+              </w:rPr>
+              <w:t xml:space="preserve">CMD.UPDATE</w:t>
+            </w:r>
+            <w:r>
+              <w:t xml:space="preserve">. A write alone changes nothing: with the counter running, END written without</w:t>
+            </w:r>
+            <w:r>
+              <w:t xml:space="preserve"> </w:t>
+            </w:r>
+            <w:r>
+              <w:rPr>
+                <w:rStyle w:val="VerbatimChar"/>
+              </w:rPr>
+              <w:t xml:space="preserve">UPDATE</w:t>
+            </w:r>
+            <w:r>
+              <w:t xml:space="preserve"> </w:t>
+            </w:r>
+            <w:r>
+              <w:t xml:space="preserve">leaves the period unchanged</w:t>
+            </w:r>
+          </w:p>
+        </w:tc>
+      </w:tr>
+      <w:tr>
+        <w:tc>
+          <w:tcPr/>
+          <w:p>
+            <w:pPr>
+              <w:pStyle w:val="Compact"/>
+              <w:jc w:val="left"/>
+            </w:pPr>
+            <w:r>
+              <w:rPr>
+                <w:rStyle w:val="VerbatimChar"/>
+              </w:rPr>
+              <w:t xml:space="preserve">CMD.UPDATE</w:t>
+            </w:r>
+            <w:r>
+              <w:t xml:space="preserve">, running</w:t>
+            </w:r>
+          </w:p>
+        </w:tc>
+        <w:tc>
+          <w:tcPr/>
+          <w:p>
+            <w:pPr>
+              <w:pStyle w:val="Compact"/>
+              <w:jc w:val="left"/>
+            </w:pPr>
+            <w:r>
+              <w:t xml:space="preserve">at the end of the period in progress, which keeps its old length; the next period uses the new START, END and</w:t>
+            </w:r>
+            <w:r>
+              <w:t xml:space="preserve"> </w:t>
+            </w:r>
+            <w:r>
+              <w:rPr>
+                <w:rStyle w:val="VerbatimChar"/>
+              </w:rPr>
+              <w:t xml:space="preserve">SAW</w:t>
+            </w:r>
+          </w:p>
+        </w:tc>
+      </w:tr>
+      <w:tr>
+        <w:tc>
+          <w:tcPr/>
+          <w:p>
+            <w:pPr>
+              <w:pStyle w:val="Compact"/>
+              <w:jc w:val="left"/>
+            </w:pPr>
+            <w:r>
+              <w:rPr>
+                <w:rStyle w:val="VerbatimChar"/>
+              </w:rPr>
+              <w:t xml:space="preserve">CMD.UPDATE</w:t>
+            </w:r>
+            <w:r>
+              <w:t xml:space="preserve">, stopped</w:t>
+            </w:r>
+          </w:p>
+        </w:tc>
+        <w:tc>
+          <w:tcPr/>
+          <w:p>
+            <w:pPr>
+              <w:pStyle w:val="Compact"/>
+              <w:jc w:val="left"/>
+            </w:pPr>
+            <w:r>
+              <w:t xml:space="preserve">at once:</w:t>
+            </w:r>
+            <w:r>
+              <w:t xml:space="preserve"> </w:t>
+            </w:r>
+            <w:r>
+              <w:rPr>
+                <w:rStyle w:val="VerbatimChar"/>
+              </w:rPr>
+              <w:t xml:space="preserve">COUNTER</w:t>
+            </w:r>
+            <w:r>
+              <w:t xml:space="preserve"> </w:t>
+            </w:r>
+            <w:r>
+              <w:t xml:space="preserve">reads START. A</w:t>
+            </w:r>
+            <w:r>
+              <w:t xml:space="preserve"> </w:t>
+            </w:r>
+            <w:r>
+              <w:rPr>
+                <w:rStyle w:val="VerbatimChar"/>
+              </w:rPr>
+              <w:t xml:space="preserve">TH</w:t>
+            </w:r>
+            <w:r>
+              <w:t xml:space="preserve"> </w:t>
+            </w:r>
+            <w:r>
+              <w:t xml:space="preserve">write while stopped leaves</w:t>
+            </w:r>
+            <w:r>
+              <w:t xml:space="preserve"> </w:t>
+            </w:r>
+            <w:r>
+              <w:rPr>
+                <w:rStyle w:val="VerbatimChar"/>
+              </w:rPr>
+              <w:t xml:space="preserve">COUNTER</w:t>
+            </w:r>
+            <w:r>
+              <w:t xml:space="preserve"> </w:t>
+            </w:r>
+            <w:r>
+              <w:t xml:space="preserve">as it was</w:t>
+            </w:r>
+          </w:p>
+        </w:tc>
+      </w:tr>
+      <w:tr>
+        <w:tc>
+          <w:tcPr/>
+          <w:p>
+            <w:pPr>
+              <w:pStyle w:val="Compact"/>
+              <w:jc w:val="left"/>
+            </w:pPr>
+            <w:r>
+              <w:rPr>
+                <w:rStyle w:val="VerbatimChar"/>
+              </w:rPr>
+              <w:t xml:space="preserve">CMD.START</w:t>
+            </w:r>
+          </w:p>
+        </w:tc>
+        <w:tc>
+          <w:tcPr/>
+          <w:p>
+            <w:pPr>
+              <w:pStyle w:val="Compact"/>
+              <w:jc w:val="left"/>
+            </w:pPr>
+            <w:r>
+              <w:t xml:space="preserve">loads START, END and</w:t>
+            </w:r>
+            <w:r>
+              <w:t xml:space="preserve"> </w:t>
+            </w:r>
+            <w:r>
+              <w:rPr>
+                <w:rStyle w:val="VerbatimChar"/>
+              </w:rPr>
+              <w:t xml:space="preserve">SAW</w:t>
+            </w:r>
+            <w:r>
+              <w:t xml:space="preserve">; the first period is END - START + 1 count events</w:t>
+            </w:r>
+          </w:p>
+        </w:tc>
+      </w:tr>
+      <w:tr>
+        <w:tc>
+          <w:tcPr/>
+          <w:p>
+            <w:pPr>
+              <w:pStyle w:val="Compact"/>
+              <w:jc w:val="left"/>
+            </w:pPr>
+            <w:r>
+              <w:rPr>
+                <w:rStyle w:val="VerbatimChar"/>
+              </w:rPr>
+              <w:t xml:space="preserve">CHn_TH</w:t>
+            </w:r>
+            <w:r>
+              <w:t xml:space="preserve"> </w:t>
+            </w:r>
+            <w:r>
+              <w:t xml:space="preserve">(</w:t>
+            </w:r>
+            <w:r>
+              <w:rPr>
+                <w:rStyle w:val="VerbatimChar"/>
+              </w:rPr>
+              <w:t xml:space="preserve">TH</w:t>
+            </w:r>
+            <w:r>
+              <w:t xml:space="preserve">,</w:t>
+            </w:r>
+            <w:r>
+              <w:t xml:space="preserve"> </w:t>
+            </w:r>
+            <w:r>
+              <w:rPr>
+                <w:rStyle w:val="VerbatimChar"/>
+              </w:rPr>
+              <w:t xml:space="preserve">MODE</w:t>
+            </w:r>
+            <w:r>
+              <w:t xml:space="preserve">),</w:t>
+            </w:r>
+            <w:r>
+              <w:t xml:space="preserve"> </w:t>
+            </w:r>
+            <w:r>
+              <w:rPr>
+                <w:rStyle w:val="VerbatimChar"/>
+              </w:rPr>
+              <w:t xml:space="preserve">CFG.PRESC</w:t>
+            </w:r>
+            <w:r>
+              <w:t xml:space="preserve">,</w:t>
+            </w:r>
+            <w:r>
+              <w:t xml:space="preserve"> </w:t>
+            </w:r>
+            <w:r>
+              <w:rPr>
+                <w:rStyle w:val="VerbatimChar"/>
+              </w:rPr>
+              <w:t xml:space="preserve">CFG.IN_SEL</w:t>
+            </w:r>
+            <w:r>
+              <w:t xml:space="preserve">,</w:t>
+            </w:r>
+            <w:r>
+              <w:t xml:space="preserve"> </w:t>
+            </w:r>
+            <w:r>
+              <w:rPr>
+                <w:rStyle w:val="VerbatimChar"/>
+              </w:rPr>
+              <w:t xml:space="preserve">CFG.IN_MODE</w:t>
+            </w:r>
+          </w:p>
+        </w:tc>
+        <w:tc>
+          <w:tcPr/>
+          <w:p>
+            <w:pPr>
+              <w:pStyle w:val="Compact"/>
+              <w:jc w:val="left"/>
+            </w:pPr>
+            <w:r>
+              <w:t xml:space="preserve">at the next count event, in the period in progress, without</w:t>
+            </w:r>
+            <w:r>
+              <w:t xml:space="preserve"> </w:t>
+            </w:r>
+            <w:r>
+              <w:rPr>
+                <w:rStyle w:val="VerbatimChar"/>
+              </w:rPr>
+              <w:t xml:space="preserve">UPDATE</w:t>
+            </w:r>
+          </w:p>
+        </w:tc>
+      </w:tr>
+    </w:tbl>
+    <w:p>
+      <w:pPr>
+        <w:pStyle w:val="BodyText"/>
+      </w:pPr>
+      <w:r>
+        <w:t xml:space="preserve">Consequence for</w:t>
+      </w:r>
+      <w:r>
+        <w:t xml:space="preserve"> </w:t>
+      </w:r>
+      <w:r>
+        <w:rPr>
+          <w:rStyle w:val="VerbatimChar"/>
+        </w:rPr>
+        <w:t xml:space="preserve">CHn_TH</w:t>
+      </w:r>
+      <w:r>
+        <w:t xml:space="preserve">: a value above the counter is used in the period in progress.</w:t>
+      </w:r>
+      <w:r>
+        <w:t xml:space="preserve"> </w:t>
+      </w:r>
+      <w:r>
+        <w:t xml:space="preserve">A value</w:t>
+      </w:r>
+      <w:r>
+        <w:t xml:space="preserve"> </w:t>
+      </w:r>
+      <w:r>
+        <w:rPr>
+          <w:b/>
+          <w:bCs/>
+        </w:rPr>
+        <w:t xml:space="preserve">below</w:t>
+      </w:r>
+      <w:r>
+        <w:t xml:space="preserve"> </w:t>
+      </w:r>
+      <w:r>
+        <w:t xml:space="preserve">the counter has already passed, so its match is missed in this period.</w:t>
+      </w:r>
+      <w:r>
+        <w:t xml:space="preserve"> </w:t>
+      </w:r>
+      <w:r>
+        <w:t xml:space="preserve">With</w:t>
+      </w:r>
+      <w:r>
+        <w:t xml:space="preserve"> </w:t>
+      </w:r>
+      <w:r>
+        <w:rPr>
+          <w:rStyle w:val="VerbatimChar"/>
+        </w:rPr>
+        <w:t xml:space="preserve">MODE</w:t>
+      </w:r>
+      <w:r>
+        <w:t xml:space="preserve"> </w:t>
+      </w:r>
+      <w:r>
+        <w:t xml:space="preserve">6 (RSTSET) the output stays high to the end of the period and falls at the</w:t>
+      </w:r>
+      <w:r>
+        <w:t xml:space="preserve"> </w:t>
+      </w:r>
+      <w:r>
+        <w:t xml:space="preserve">match in the next one, so one pulse is long. To change a duty cycle without a wrong</w:t>
+      </w:r>
+      <w:r>
+        <w:t xml:space="preserve"> </w:t>
+      </w:r>
+      <w:r>
+        <w:t xml:space="preserve">pulse, write</w:t>
+      </w:r>
+      <w:r>
+        <w:t xml:space="preserve"> </w:t>
+      </w:r>
+      <w:r>
+        <w:rPr>
+          <w:rStyle w:val="VerbatimChar"/>
+        </w:rPr>
+        <w:t xml:space="preserve">CHn_TH</w:t>
+      </w:r>
+      <w:r>
+        <w:t xml:space="preserve"> </w:t>
+      </w:r>
+      <w:r>
+        <w:t xml:space="preserve">just after the period starts, while the counter is still below</w:t>
+      </w:r>
+      <w:r>
+        <w:t xml:space="preserve"> </w:t>
+      </w:r>
+      <w:r>
+        <w:t xml:space="preserve">both the old and the new value.</w:t>
+      </w:r>
+    </w:p>
+    <w:bookmarkEnd w:id="43"/>
+    <w:bookmarkEnd w:id="44"/>
+    <w:bookmarkStart w:id="45" w:name="instances"/>
+    <w:p>
+      <w:pPr>
+        <w:pStyle w:val="Heading1"/>
+      </w:pPr>
+      <w:r>
+        <w:t xml:space="preserve">8. Instances</w:t>
+      </w:r>
+    </w:p>
+    <w:p>
+      <w:pPr>
+        <w:pStyle w:val="FirstParagraph"/>
+      </w:pPr>
+      <w:r>
         <w:t xml:space="preserve">One, on</w:t>
       </w:r>
       <w:r>
@@ -7938,8 +8717,8 @@
         <w:t xml:space="preserve">= 16. The four timer modules are internal to the IP.</w:t>
       </w:r>
     </w:p>
-    <w:bookmarkEnd w:id="44"/>
-    <w:bookmarkStart w:id="45" w:name="X31074a9102d88bba972e4f71edc3e97f3cd819b"/>
+    <w:bookmarkEnd w:id="45"/>
+    <w:bookmarkStart w:id="46" w:name="X31074a9102d88bba972e4f71edc3e97f3cd819b"/>
     <w:p>
       <w:pPr>
         <w:pStyle w:val="Heading1"/>
@@ -8138,8 +8917,8 @@
         </w:tc>
       </w:tr>
     </w:tbl>
-    <w:bookmarkEnd w:id="45"/>
-    <w:bookmarkStart w:id="46" w:name="tie-offs"/>
+    <w:bookmarkEnd w:id="46"/>
+    <w:bookmarkStart w:id="47" w:name="tie-offs"/>
     <w:p>
       <w:pPr>
         <w:pStyle w:val="Heading1"/>
@@ -8447,8 +9226,8 @@
         </w:tc>
       </w:tr>
     </w:tbl>
-    <w:bookmarkEnd w:id="46"/>
-    <w:bookmarkStart w:id="47" w:name="requirements-on-others-and-open-items"/>
+    <w:bookmarkEnd w:id="47"/>
+    <w:bookmarkStart w:id="48" w:name="requirements-on-others-and-open-items"/>
     <w:p>
       <w:pPr>
         <w:pStyle w:val="Heading1"/>
@@ -8821,8 +9600,8 @@
         <w:t xml:space="preserve">gate count, after synthesis.</w:t>
       </w:r>
     </w:p>
-    <w:bookmarkEnd w:id="47"/>
-    <w:bookmarkStart w:id="48" w:name="verification"/>
+    <w:bookmarkEnd w:id="48"/>
+    <w:bookmarkStart w:id="49" w:name="verification"/>
     <w:p>
       <w:pPr>
         <w:pStyle w:val="Heading1"/>
@@ -9480,7 +10259,7 @@
         <w:t xml:space="preserve"> </w:t>
       </w:r>
       <w:r>
-        <w:t xml:space="preserve">Confirm in simulation: when a new</w:t>
+        <w:t xml:space="preserve">Each row of the table in 7.8 holds:</w:t>
       </w:r>
       <w:r>
         <w:t xml:space="preserve"> </w:t>
@@ -9495,7 +10274,7 @@
         <w:t xml:space="preserve"> </w:t>
       </w:r>
       <w:r>
-        <w:t xml:space="preserve">takes effect (at</w:t>
+        <w:t xml:space="preserve">is used only at</w:t>
       </w:r>
       <w:r>
         <w:t xml:space="preserve"> </w:t>
@@ -9507,7 +10286,10 @@
         <w:t xml:space="preserve">CMD.START</w:t>
       </w:r>
       <w:r>
-        <w:t xml:space="preserve">, at</w:t>
+        <w:t xml:space="preserve"> </w:t>
+      </w:r>
+      <w:r>
+        <w:t xml:space="preserve">or</w:t>
       </w:r>
       <w:r>
         <w:t xml:space="preserve"> </w:t>
@@ -9522,28 +10304,7 @@
         <w:t xml:space="preserve"> </w:t>
       </w:r>
       <w:r>
-        <w:t xml:space="preserve">while stopped, at the period end after</w:t>
-      </w:r>
-      <w:r>
-        <w:t xml:space="preserve"> </w:t>
-      </w:r>
-      <w:r>
-        <w:rPr>
-          <w:rStyle w:val="VerbatimChar"/>
-        </w:rPr>
-        <w:t xml:space="preserve">CMD.UPDATE</w:t>
-      </w:r>
-      <w:r>
-        <w:t xml:space="preserve"> </w:t>
-      </w:r>
-      <w:r>
-        <w:t xml:space="preserve">while running),</w:t>
-      </w:r>
-      <w:r>
-        <w:t xml:space="preserve"> </w:t>
-      </w:r>
-      <w:r>
-        <w:t xml:space="preserve">and when new</w:t>
+        <w:t xml:space="preserve">(stopped: at once; running: at the end of the period in progress);</w:t>
       </w:r>
       <w:r>
         <w:t xml:space="preserve"> </w:t>
@@ -9555,6 +10316,27 @@
         <w:t xml:space="preserve">CHn_TH</w:t>
       </w:r>
       <w:r>
+        <w:t xml:space="preserve"> </w:t>
+      </w:r>
+      <w:r>
+        <w:t xml:space="preserve">raised before its match is used in the period in progress, lowered below</w:t>
+      </w:r>
+      <w:r>
+        <w:t xml:space="preserve"> </w:t>
+      </w:r>
+      <w:r>
+        <w:t xml:space="preserve">the counter it is used in the next one;</w:t>
+      </w:r>
+      <w:r>
+        <w:t xml:space="preserve"> </w:t>
+      </w:r>
+      <w:r>
+        <w:rPr>
+          <w:rStyle w:val="VerbatimChar"/>
+        </w:rPr>
+        <w:t xml:space="preserve">PRESC</w:t>
+      </w:r>
+      <w:r>
         <w:t xml:space="preserve">,</w:t>
       </w:r>
       <w:r>
@@ -9567,7 +10349,10 @@
         <w:t xml:space="preserve">IN_SEL</w:t>
       </w:r>
       <w:r>
-        <w:t xml:space="preserve">,</w:t>
+        <w:t xml:space="preserve"> </w:t>
+      </w:r>
+      <w:r>
+        <w:t xml:space="preserve">and</w:t>
       </w:r>
       <w:r>
         <w:t xml:space="preserve"> </w:t>
@@ -9582,28 +10367,13 @@
         <w:t xml:space="preserve"> </w:t>
       </w:r>
       <w:r>
-        <w:t xml:space="preserve">and</w:t>
-      </w:r>
-      <w:r>
-        <w:t xml:space="preserve"> </w:t>
-      </w:r>
-      <w:r>
-        <w:rPr>
-          <w:rStyle w:val="VerbatimChar"/>
-        </w:rPr>
-        <w:t xml:space="preserve">PRESC</w:t>
-      </w:r>
-      <w:r>
-        <w:t xml:space="preserve"> </w:t>
-      </w:r>
-      <w:r>
-        <w:t xml:space="preserve">values take effect while</w:t>
-      </w:r>
-      <w:r>
-        <w:t xml:space="preserve"> </w:t>
-      </w:r>
-      <w:r>
-        <w:t xml:space="preserve">running.</w:t>
+        <w:t xml:space="preserve">take effect</w:t>
+      </w:r>
+      <w:r>
+        <w:t xml:space="preserve"> </w:t>
+      </w:r>
+      <w:r>
+        <w:t xml:space="preserve">while running.</w:t>
       </w:r>
     </w:p>
     <w:p>
@@ -9645,8 +10415,8 @@
         <w:t xml:space="preserve">cycle wide on a rising edge of the channel firmware selected.</w:t>
       </w:r>
     </w:p>
-    <w:bookmarkEnd w:id="48"/>
-    <w:bookmarkStart w:id="49" w:name="appendix-a.-acronyms"/>
+    <w:bookmarkEnd w:id="49"/>
+    <w:bookmarkStart w:id="50" w:name="appendix-a.-acronyms"/>
     <w:p>
       <w:pPr>
         <w:pStyle w:val="Heading1"/>
@@ -9808,8 +10578,8 @@
         </w:tc>
       </w:tr>
     </w:tbl>
-    <w:bookmarkEnd w:id="49"/>
-    <w:bookmarkStart w:id="50" w:name="appendix-b.-first-review"/>
+    <w:bookmarkEnd w:id="50"/>
+    <w:bookmarkStart w:id="51" w:name="appendix-b.-first-review"/>
     <w:p>
       <w:pPr>
         <w:pStyle w:val="Heading1"/>
@@ -10066,7 +10836,7 @@
         </w:tc>
       </w:tr>
     </w:tbl>
-    <w:bookmarkEnd w:id="50"/>
+    <w:bookmarkEnd w:id="51"/>
     <w:sectPr>
       <w:headerReference r:id="rId11" w:type="default"/>
       <w:footerReference r:id="rId12" w:type="even"/>
@@ -10305,7 +11075,7 @@
       <w:rPr>
         <w:szCs w:val="26"/>
       </w:rPr>
-      <w:t>V2.8</w:t>
+      <w:t>V2.9</w:t>
     </w:r>
     <w:r>
       <w:rPr>

</xml_diff>

<commit_message>
docs(pwm): mas 11 states the pad functions and their state after reset
From the 40-pin pad list: PWM_0..7 are outputs with OE = 1 while selected,
TIM_EXT0..3 are inputs, and every pad is GPIO (b00) or Hi-Z after reset, so
the open item on the IO MUX default is answered.
</commit_message>
<xml_diff>
--- a/doc/specs/docx/QNSC_PWM_MAS.docx
+++ b/doc/specs/docx/QNSC_PWM_MAS.docx
@@ -1447,7 +1447,7 @@
               <w:t xml:space="preserve">PWM_011</w:t>
             </w:r>
             <w:r>
-              <w:t xml:space="preserve">. Section 12:</w:t>
+              <w:t xml:space="preserve">. Section 11: pad functions and their state after reset. Section 12:</w:t>
             </w:r>
             <w:r>
               <w:t xml:space="preserve"> </w:t>
@@ -9401,22 +9401,28 @@
               <w:jc w:val="left"/>
             </w:pPr>
             <w:r>
-              <w:t xml:space="preserve">Pins for</w:t>
+              <w:rPr>
+                <w:rStyle w:val="VerbatimChar"/>
+              </w:rPr>
+              <w:t xml:space="preserve">PWM_0..7</w:t>
             </w:r>
             <w:r>
               <w:t xml:space="preserve"> </w:t>
             </w:r>
             <w:r>
-              <w:rPr>
-                <w:rStyle w:val="VerbatimChar"/>
-              </w:rPr>
-              <w:t xml:space="preserve">PWM_0..7</w:t>
+              <w:t xml:space="preserve">are output pads (</w:t>
+            </w:r>
+            <w:r>
+              <w:rPr>
+                <w:rStyle w:val="VerbatimChar"/>
+              </w:rPr>
+              <w:t xml:space="preserve">OE</w:t>
             </w:r>
             <w:r>
               <w:t xml:space="preserve"> </w:t>
             </w:r>
             <w:r>
-              <w:t xml:space="preserve">and</w:t>
+              <w:t xml:space="preserve">= 1 while selected) on</w:t>
             </w:r>
             <w:r>
               <w:t xml:space="preserve"> </w:t>
@@ -9425,10 +9431,163 @@
               <w:rPr>
                 <w:rStyle w:val="VerbatimChar"/>
               </w:rPr>
+              <w:t xml:space="preserve">PIN_23</w:t>
+            </w:r>
+            <w:r>
+              <w:t xml:space="preserve">–</w:t>
+            </w:r>
+            <w:r>
+              <w:rPr>
+                <w:rStyle w:val="VerbatimChar"/>
+              </w:rPr>
+              <w:t xml:space="preserve">26</w:t>
+            </w:r>
+            <w:r>
+              <w:t xml:space="preserve">,</w:t>
+            </w:r>
+            <w:r>
+              <w:t xml:space="preserve"> </w:t>
+            </w:r>
+            <w:r>
+              <w:rPr>
+                <w:rStyle w:val="VerbatimChar"/>
+              </w:rPr>
+              <w:t xml:space="preserve">29</w:t>
+            </w:r>
+            <w:r>
+              <w:t xml:space="preserve">,</w:t>
+            </w:r>
+            <w:r>
+              <w:t xml:space="preserve"> </w:t>
+            </w:r>
+            <w:r>
+              <w:rPr>
+                <w:rStyle w:val="VerbatimChar"/>
+              </w:rPr>
+              <w:t xml:space="preserve">30</w:t>
+            </w:r>
+            <w:r>
+              <w:t xml:space="preserve">,</w:t>
+            </w:r>
+            <w:r>
+              <w:t xml:space="preserve"> </w:t>
+            </w:r>
+            <w:r>
+              <w:rPr>
+                <w:rStyle w:val="VerbatimChar"/>
+              </w:rPr>
+              <w:t xml:space="preserve">39</w:t>
+            </w:r>
+            <w:r>
+              <w:t xml:space="preserve">,</w:t>
+            </w:r>
+            <w:r>
+              <w:t xml:space="preserve"> </w:t>
+            </w:r>
+            <w:r>
+              <w:rPr>
+                <w:rStyle w:val="VerbatimChar"/>
+              </w:rPr>
+              <w:t xml:space="preserve">40</w:t>
+            </w:r>
+            <w:r>
+              <w:t xml:space="preserve">;</w:t>
+            </w:r>
+            <w:r>
+              <w:t xml:space="preserve"> </w:t>
+            </w:r>
+            <w:r>
+              <w:rPr>
+                <w:rStyle w:val="VerbatimChar"/>
+              </w:rPr>
               <w:t xml:space="preserve">TIM_EXT0..3</w:t>
             </w:r>
             <w:r>
-              <w:t xml:space="preserve">, and their IO MUX default after reset</w:t>
+              <w:t xml:space="preserve"> </w:t>
+            </w:r>
+            <w:r>
+              <w:t xml:space="preserve">are input pads (</w:t>
+            </w:r>
+            <w:r>
+              <w:rPr>
+                <w:rStyle w:val="VerbatimChar"/>
+              </w:rPr>
+              <w:t xml:space="preserve">OE</w:t>
+            </w:r>
+            <w:r>
+              <w:t xml:space="preserve"> </w:t>
+            </w:r>
+            <w:r>
+              <w:t xml:space="preserve">= 0) on</w:t>
+            </w:r>
+            <w:r>
+              <w:t xml:space="preserve"> </w:t>
+            </w:r>
+            <w:r>
+              <w:rPr>
+                <w:rStyle w:val="VerbatimChar"/>
+              </w:rPr>
+              <w:t xml:space="preserve">PIN_31</w:t>
+            </w:r>
+            <w:r>
+              <w:t xml:space="preserve">–</w:t>
+            </w:r>
+            <w:r>
+              <w:rPr>
+                <w:rStyle w:val="VerbatimChar"/>
+              </w:rPr>
+              <w:t xml:space="preserve">34</w:t>
+            </w:r>
+            <w:r>
+              <w:t xml:space="preserve">. After reset each pad is</w:t>
+            </w:r>
+            <w:r>
+              <w:t xml:space="preserve"> </w:t>
+            </w:r>
+            <w:r>
+              <w:rPr>
+                <w:rStyle w:val="VerbatimChar"/>
+              </w:rPr>
+              <w:t xml:space="preserve">GPIO</w:t>
+            </w:r>
+            <w:r>
+              <w:t xml:space="preserve"> </w:t>
+            </w:r>
+            <w:r>
+              <w:t xml:space="preserve">(</w:t>
+            </w:r>
+            <w:r>
+              <w:rPr>
+                <w:rStyle w:val="VerbatimChar"/>
+              </w:rPr>
+              <w:t xml:space="preserve">b00</w:t>
+            </w:r>
+            <w:r>
+              <w:t xml:space="preserve">), or Hi-Z on</w:t>
+            </w:r>
+            <w:r>
+              <w:t xml:space="preserve"> </w:t>
+            </w:r>
+            <w:r>
+              <w:rPr>
+                <w:rStyle w:val="VerbatimChar"/>
+              </w:rPr>
+              <w:t xml:space="preserve">PIN_33</w:t>
+            </w:r>
+            <w:r>
+              <w:t xml:space="preserve">,</w:t>
+            </w:r>
+            <w:r>
+              <w:t xml:space="preserve"> </w:t>
+            </w:r>
+            <w:r>
+              <w:rPr>
+                <w:rStyle w:val="VerbatimChar"/>
+              </w:rPr>
+              <w:t xml:space="preserve">PIN_34</w:t>
+            </w:r>
+            <w:r>
+              <w:t xml:space="preserve">, so no PWM output drives a pin until firmware selects it</w:t>
             </w:r>
           </w:p>
         </w:tc>
@@ -9452,7 +9611,7 @@
               <w:jc w:val="left"/>
             </w:pPr>
             <w:r>
-              <w:t xml:space="preserve">pin owner out of reset</w:t>
+              <w:t xml:space="preserve">a power stage sees a floating input until firmware selects the function</w:t>
             </w:r>
           </w:p>
         </w:tc>

</xml_diff>

<commit_message>
fix(pwm): apb offset is 14 bits, as the contract now says
meta.apb_paddr_width changed to 14 in #77. The wrapper instance and the
generated port become 14 bits; the IP decodes the same PADDR[9:2], so
nothing else changes. MAS V2.8: the port table says 14 and the
requirement on the bus owner no longer says that P_BUS subtracts the
base. DECISIONS keeps its rows and gains a note.
</commit_message>
<xml_diff>
--- a/doc/specs/docx/QNSC_PWM_MAS.docx
+++ b/doc/specs/docx/QNSC_PWM_MAS.docx
@@ -15,7 +15,7 @@
         <w:pStyle w:val="Subtitle"/>
       </w:pPr>
       <w:r>
-        <w:t xml:space="preserve">MICRO-ARCHITECTURE SPECIFICATION – V2.7</w:t>
+        <w:t xml:space="preserve">MICRO-ARCHITECTURE SPECIFICATION – V2.8</w:t>
       </w:r>
     </w:p>
     <w:p>
@@ -1180,6 +1180,134 @@
           </w:p>
         </w:tc>
       </w:tr>
+      <w:tr>
+        <w:tc>
+          <w:tcPr/>
+          <w:p>
+            <w:pPr>
+              <w:pStyle w:val="Compact"/>
+              <w:jc w:val="left"/>
+            </w:pPr>
+            <w:r>
+              <w:t xml:space="preserve">V2.8</w:t>
+            </w:r>
+          </w:p>
+        </w:tc>
+        <w:tc>
+          <w:tcPr/>
+          <w:p>
+            <w:pPr>
+              <w:pStyle w:val="Compact"/>
+              <w:jc w:val="left"/>
+            </w:pPr>
+            <w:r>
+              <w:t xml:space="preserve">2026-10-15</w:t>
+            </w:r>
+          </w:p>
+        </w:tc>
+        <w:tc>
+          <w:tcPr/>
+          <w:p>
+            <w:pPr>
+              <w:pStyle w:val="Compact"/>
+              <w:jc w:val="left"/>
+            </w:pPr>
+            <w:r>
+              <w:t xml:space="preserve">Nghia VT</w:t>
+            </w:r>
+          </w:p>
+        </w:tc>
+        <w:tc>
+          <w:tcPr/>
+          <w:p>
+            <w:pPr>
+              <w:pStyle w:val="Compact"/>
+              <w:jc w:val="left"/>
+            </w:pPr>
+            <w:r>
+              <w:t xml:space="preserve">–</w:t>
+            </w:r>
+          </w:p>
+        </w:tc>
+        <w:tc>
+          <w:tcPr/>
+          <w:p>
+            <w:pPr>
+              <w:pStyle w:val="Compact"/>
+              <w:jc w:val="left"/>
+            </w:pPr>
+            <w:r>
+              <w:rPr>
+                <w:rStyle w:val="VerbatimChar"/>
+              </w:rPr>
+              <w:t xml:space="preserve">i_bus_apb_paddr</w:t>
+            </w:r>
+            <w:r>
+              <w:t xml:space="preserve"> </w:t>
+            </w:r>
+            <w:r>
+              <w:t xml:space="preserve">is 14 bits, was 12: the contract</w:t>
+            </w:r>
+            <w:r>
+              <w:t xml:space="preserve"> </w:t>
+            </w:r>
+            <w:r>
+              <w:rPr>
+                <w:rStyle w:val="VerbatimChar"/>
+              </w:rPr>
+              <w:t xml:space="preserve">meta.apb_paddr_width</w:t>
+            </w:r>
+            <w:r>
+              <w:t xml:space="preserve"> </w:t>
+            </w:r>
+            <w:r>
+              <w:t xml:space="preserve">changed in #77 because the windows are 16 KiB. The requirement on the bus owner no longer says that</w:t>
+            </w:r>
+            <w:r>
+              <w:t xml:space="preserve"> </w:t>
+            </w:r>
+            <w:r>
+              <w:rPr>
+                <w:rStyle w:val="VerbatimChar"/>
+              </w:rPr>
+              <w:t xml:space="preserve">P_BUS</w:t>
+            </w:r>
+            <w:r>
+              <w:t xml:space="preserve"> </w:t>
+            </w:r>
+            <w:r>
+              <w:t xml:space="preserve">subtracts the base (nothing does; the window is aligned to its size). The decode is unchanged:</w:t>
+            </w:r>
+            <w:r>
+              <w:t xml:space="preserve"> </w:t>
+            </w:r>
+            <w:r>
+              <w:rPr>
+                <w:rStyle w:val="VerbatimChar"/>
+              </w:rPr>
+              <w:t xml:space="preserve">PADDR[9:2]</w:t>
+            </w:r>
+            <w:r>
+              <w:t xml:space="preserve">, so the 1 KiB map repeats every</w:t>
+            </w:r>
+            <w:r>
+              <w:t xml:space="preserve"> </w:t>
+            </w:r>
+            <w:r>
+              <w:rPr>
+                <w:rStyle w:val="VerbatimChar"/>
+              </w:rPr>
+              <w:t xml:space="preserve">0x400</w:t>
+            </w:r>
+            <w:r>
+              <w:t xml:space="preserve"> </w:t>
+            </w:r>
+            <w:r>
+              <w:t xml:space="preserve">across the window</w:t>
+            </w:r>
+          </w:p>
+        </w:tc>
+      </w:tr>
     </w:tbl>
     <w:bookmarkEnd w:id="26"/>
     <w:bookmarkStart w:id="27" w:name="overview"/>
@@ -2393,7 +2521,7 @@
               <w:jc w:val="right"/>
             </w:pPr>
             <w:r>
-              <w:t xml:space="preserve">12</w:t>
+              <w:t xml:space="preserve">14</w:t>
             </w:r>
           </w:p>
         </w:tc>
@@ -8403,25 +8531,13 @@
               <w:rPr>
                 <w:rStyle w:val="VerbatimChar"/>
               </w:rPr>
-              <w:t xml:space="preserve">i_bus_apb_paddr[11:0]</w:t>
+              <w:t xml:space="preserve">i_bus_apb_paddr[13:0]</w:t>
             </w:r>
             <w:r>
               <w:t xml:space="preserve"> </w:t>
             </w:r>
             <w:r>
-              <w:t xml:space="preserve">= the low 12 bits of the offset (</w:t>
-            </w:r>
-            <w:r>
-              <w:rPr>
-                <w:rStyle w:val="VerbatimChar"/>
-              </w:rPr>
-              <w:t xml:space="preserve">P_BUS</w:t>
-            </w:r>
-            <w:r>
-              <w:t xml:space="preserve"> </w:t>
-            </w:r>
-            <w:r>
-              <w:t xml:space="preserve">subtracts the base; offset bits 13:12 are not used)</w:t>
+              <w:t xml:space="preserve">= the offset inside the 16 KiB window, the low 14 bits of the address (the window is aligned to its size); offset bits 13:10 are not decoded</w:t>
             </w:r>
           </w:p>
         </w:tc>
@@ -10189,7 +10305,7 @@
       <w:rPr>
         <w:szCs w:val="26"/>
       </w:rPr>
-      <w:t>V2.7</w:t>
+      <w:t>V2.8</w:t>
     </w:r>
     <w:r>
       <w:rPr>

</xml_diff>

<commit_message>
test(pwm): the testbench drives 14 address bits; pwm_010 aliases across the window
tb_pwm and the tests use 14-bit offsets, as the wrapper now has. PWM_010
also reads the CH0_TH register at +0x1000, +0x2000 and +0x3C00, so the
claim that the 1 KiB map repeats across the whole 16 KiB window is
measured, not only the first +0x400 and +0xC00. MAS section 12 says so.
</commit_message>
<xml_diff>
--- a/doc/specs/docx/QNSC_PWM_MAS.docx
+++ b/doc/specs/docx/QNSC_PWM_MAS.docx
@@ -10366,10 +10366,22 @@
         <w:t xml:space="preserve"> </w:t>
       </w:r>
       <w:r>
-        <w:t xml:space="preserve">Holes read 0 and ignore writes; offset</w:t>
-      </w:r>
-      <w:r>
-        <w:t xml:space="preserve"> </w:t>
+        <w:t xml:space="preserve">Holes read 0 and ignore writes; the 1 KiB map repeats every</w:t>
+      </w:r>
+      <w:r>
+        <w:t xml:space="preserve"> </w:t>
+      </w:r>
+      <w:r>
+        <w:rPr>
+          <w:rStyle w:val="VerbatimChar"/>
+        </w:rPr>
+        <w:t xml:space="preserve">0x400</w:t>
+      </w:r>
+      <w:r>
+        <w:t xml:space="preserve"> </w:t>
+      </w:r>
+      <w:r>
+        <w:t xml:space="preserve">across the 16 KiB window (</w:t>
       </w:r>
       <w:r>
         <w:rPr>
@@ -10378,10 +10390,46 @@
         <w:t xml:space="preserve">+0x400</w:t>
       </w:r>
       <w:r>
-        <w:t xml:space="preserve"> </w:t>
-      </w:r>
-      <w:r>
-        <w:t xml:space="preserve">aliases offset 0;</w:t>
+        <w:t xml:space="preserve">,</w:t>
+      </w:r>
+      <w:r>
+        <w:t xml:space="preserve"> </w:t>
+      </w:r>
+      <w:r>
+        <w:rPr>
+          <w:rStyle w:val="VerbatimChar"/>
+        </w:rPr>
+        <w:t xml:space="preserve">+0x1000</w:t>
+      </w:r>
+      <w:r>
+        <w:t xml:space="preserve">,</w:t>
+      </w:r>
+      <w:r>
+        <w:t xml:space="preserve"> </w:t>
+      </w:r>
+      <w:r>
+        <w:rPr>
+          <w:rStyle w:val="VerbatimChar"/>
+        </w:rPr>
+        <w:t xml:space="preserve">+0x2000</w:t>
+      </w:r>
+      <w:r>
+        <w:t xml:space="preserve">,</w:t>
+      </w:r>
+      <w:r>
+        <w:t xml:space="preserve"> </w:t>
+      </w:r>
+      <w:r>
+        <w:rPr>
+          <w:rStyle w:val="VerbatimChar"/>
+        </w:rPr>
+        <w:t xml:space="preserve">+0x3C00</w:t>
+      </w:r>
+      <w:r>
+        <w:t xml:space="preserve"> </w:t>
+      </w:r>
+      <w:r>
+        <w:t xml:space="preserve">alias offset 0);</w:t>
       </w:r>
       <w:r>
         <w:t xml:space="preserve"> </w:t>

</xml_diff>